<commit_message>
Update HR AI baseline and model serving configuration
</commit_message>
<xml_diff>
--- a/data/resumes/arabic/sample_ar_001.docx
+++ b/data/resumes/arabic/sample_ar_001.docx
@@ -9,7 +9,23 @@
     </w:p>
     <w:p>
       <w:r>
-        <w:t>sarah.alamin@example.com | 966501234567+</w:t>
+        <w:t>sarah.alamin@example.com | 966501234567+ | الرياض، المملكة العربية السعودية</w:t>
+      </w:r>
+    </w:p>
+    <w:p/>
+    <w:p>
+      <w:r>
+        <w:t>نبذة</w:t>
+      </w:r>
+    </w:p>
+    <w:p>
+      <w:r>
+        <w:t>مهندسة برمجيات لديها خمس سنوات من الخبرة في بناء خطوط البيانات والبنية</w:t>
+      </w:r>
+    </w:p>
+    <w:p>
+      <w:r>
+        <w:t>التحتية للتعلم الآلي.</w:t>
       </w:r>
     </w:p>
     <w:p/>
@@ -20,7 +36,7 @@
     </w:p>
     <w:p>
       <w:r>
-        <w:t>بكالوريوس علوم حاسب، جامعة الملك سعود، 2016-2020</w:t>
+        <w:t>بكالوريوس علوم حاسب، جامعة الملك سعود، 2016-2020، معدل تراكمي 3.8</w:t>
       </w:r>
     </w:p>
     <w:p/>
@@ -53,23 +69,12 @@
     <w:p/>
     <w:p>
       <w:r>
-        <w:t>المهارات التقنية</w:t>
+        <w:t>المهارات</w:t>
       </w:r>
     </w:p>
     <w:p>
       <w:r>
-        <w:t>بايثون، إس كيو إل، دوكر، كوبرنيتيس، أمازون ويب سيرفيسز</w:t>
-      </w:r>
-    </w:p>
-    <w:p/>
-    <w:p>
-      <w:r>
-        <w:t>المهارات الشخصية</w:t>
-      </w:r>
-    </w:p>
-    <w:p>
-      <w:r>
-        <w:t>القيادة، التواصل، حل المشكلات</w:t>
+        <w:t>بايثون، إس كيو إل، دوكر، كوبرنيتيس، أمازون ويب سيرفيسز، القيادة، التواصل، حل المشكلات</w:t>
       </w:r>
     </w:p>
     <w:p/>
@@ -80,7 +85,23 @@
     </w:p>
     <w:p>
       <w:r>
-        <w:t>شهادة AWS للحلول المعمارية المعتمدة، أمازون، 2022</w:t>
+        <w:t>شهادة AWS للحلول المعمارية المعتمدة، أمازون، صدرت 2022</w:t>
+      </w:r>
+    </w:p>
+    <w:p/>
+    <w:p>
+      <w:r>
+        <w:t>المشاريع</w:t>
+      </w:r>
+    </w:p>
+    <w:p>
+      <w:r>
+        <w:t>محلل السير الذاتية، github.com/sarahalamin/resume-parser</w:t>
+      </w:r>
+    </w:p>
+    <w:p>
+      <w:r>
+        <w:t>خط أنابيب مفتوح المصدر لتحليل السير الذاتية ثنائية اللغة.</w:t>
       </w:r>
     </w:p>
     <w:p/>

</xml_diff>